<commit_message>
docs: dvp atualizado com novas funcionalidades e tecnologias
</commit_message>
<xml_diff>
--- a/DVP_PampaTickets.docx
+++ b/DVP_PampaTickets.docx
@@ -1569,6 +1569,64 @@
                 <w:szCs w:val="18"/>
               </w:rPr>
               <w:t>07/04/2026</w:t>
+            </w:r>
+          </w:p>
+        </w:tc>
+      </w:tr>
+      <w:tr>
+        <w:tc>
+          <w:tcPr>
+            <w:tcW w:type="dxa" w:w="988"/>
+          </w:tcPr>
+          <w:p>
+            <w:r>
+              <w:rPr>
+                <w:rFonts w:ascii="Arial" w:eastAsia="Arial" w:hAnsi="Arial" w:cs="Arial"/>
+                <w:sz w:val="18"/>
+              </w:rPr>
+              <w:t>1.7</w:t>
+            </w:r>
+          </w:p>
+        </w:tc>
+        <w:tc>
+          <w:tcPr>
+            <w:tcW w:type="dxa" w:w="4841"/>
+          </w:tcPr>
+          <w:p>
+            <w:r>
+              <w:rPr>
+                <w:rFonts w:ascii="Arial" w:eastAsia="Arial" w:hAnsi="Arial" w:cs="Arial"/>
+                <w:sz w:val="18"/>
+              </w:rPr>
+              <w:t>Inclusão das integrações Asaas, SMTP (Gmail) e mapa Leaflet/OpenStreetMap na stack do projeto</w:t>
+            </w:r>
+          </w:p>
+        </w:tc>
+        <w:tc>
+          <w:tcPr>
+            <w:tcW w:type="dxa" w:w="1984"/>
+          </w:tcPr>
+          <w:p>
+            <w:r>
+              <w:rPr>
+                <w:rFonts w:ascii="Arial" w:eastAsia="Arial" w:hAnsi="Arial" w:cs="Arial"/>
+                <w:sz w:val="18"/>
+              </w:rPr>
+              <w:t>Marco</w:t>
+            </w:r>
+          </w:p>
+        </w:tc>
+        <w:tc>
+          <w:tcPr>
+            <w:tcW w:type="dxa" w:w="1395"/>
+          </w:tcPr>
+          <w:p>
+            <w:r>
+              <w:rPr>
+                <w:rFonts w:ascii="Arial" w:eastAsia="Arial" w:hAnsi="Arial" w:cs="Arial"/>
+                <w:sz w:val="18"/>
+              </w:rPr>
+              <w:t>21/06/2026</w:t>
             </w:r>
           </w:p>
         </w:tc>
@@ -22477,6 +22535,13 @@
         </w:rPr>
         <w:t xml:space="preserve"> é protegida por autenticação JWT, com controle de acesso baseado em perfis de usuário, Organizador e Participante.</w:t>
       </w:r>
+      <w:r>
+        <w:rPr>
+          <w:rFonts w:ascii="Arial" w:eastAsia="Arial" w:hAnsi="Arial" w:cs="Arial"/>
+          <w:sz w:val="16"/>
+        </w:rPr>
+        <w:t xml:space="preserve"> O processamento de pagamentos é intermediado pelo gateway Asaas, que recebe as cobranças (PIX e boleto) e notifica o backend via webhooks; o envio de e-mails transacionais (confirmação de cadastro, recuperação de senha, ingresso em PDF e notificações) é feito por SMTP (Gmail). A localização do evento utiliza geocoding via Nominatim (OpenStreetMap) e é exibida em um mapa interativo com Leaflet.</w:t>
+      </w:r>
     </w:p>
     <w:p>
       <w:pPr>
@@ -24872,6 +24937,226 @@
                 <w:szCs w:val="16"/>
               </w:rPr>
               <w:t xml:space="preserve"> do gateway de pagamento em desenvolvimento</w:t>
+            </w:r>
+          </w:p>
+        </w:tc>
+      </w:tr>
+      <w:tr>
+        <w:tc>
+          <w:tcPr>
+            <w:tcW w:type="dxa" w:w="3260"/>
+          </w:tcPr>
+          <w:p>
+            <w:r>
+              <w:rPr>
+                <w:rFonts w:ascii="Arial" w:eastAsia="Arial" w:hAnsi="Arial" w:cs="Arial"/>
+                <w:sz w:val="16"/>
+              </w:rPr>
+              <w:t>Asaas</w:t>
+            </w:r>
+          </w:p>
+        </w:tc>
+        <w:tc>
+          <w:tcPr>
+            <w:tcW w:type="dxa" w:w="1418"/>
+          </w:tcPr>
+          <w:p>
+            <w:r>
+              <w:rPr>
+                <w:rFonts w:ascii="Arial" w:eastAsia="Arial" w:hAnsi="Arial" w:cs="Arial"/>
+                <w:sz w:val="16"/>
+              </w:rPr>
+              <w:t>API v3 (UAT)</w:t>
+            </w:r>
+          </w:p>
+        </w:tc>
+        <w:tc>
+          <w:tcPr>
+            <w:tcW w:type="dxa" w:w="4779"/>
+          </w:tcPr>
+          <w:p>
+            <w:r>
+              <w:rPr>
+                <w:rFonts w:ascii="Arial" w:eastAsia="Arial" w:hAnsi="Arial" w:cs="Arial"/>
+                <w:sz w:val="16"/>
+              </w:rPr>
+              <w:t>Gateway de pagamento — cobranças PIX e boleto e recebimento de confirmações via webhook</w:t>
+            </w:r>
+          </w:p>
+        </w:tc>
+      </w:tr>
+      <w:tr>
+        <w:tc>
+          <w:tcPr>
+            <w:tcW w:type="dxa" w:w="3260"/>
+          </w:tcPr>
+          <w:p>
+            <w:r>
+              <w:rPr>
+                <w:rFonts w:ascii="Arial" w:eastAsia="Arial" w:hAnsi="Arial" w:cs="Arial"/>
+                <w:sz w:val="16"/>
+              </w:rPr>
+              <w:t>SMTP (Gmail)</w:t>
+            </w:r>
+          </w:p>
+        </w:tc>
+        <w:tc>
+          <w:tcPr>
+            <w:tcW w:type="dxa" w:w="1418"/>
+          </w:tcPr>
+          <w:p>
+            <w:r>
+              <w:rPr>
+                <w:rFonts w:ascii="Arial" w:eastAsia="Arial" w:hAnsi="Arial" w:cs="Arial"/>
+                <w:sz w:val="16"/>
+              </w:rPr>
+              <w:t>--</w:t>
+            </w:r>
+          </w:p>
+        </w:tc>
+        <w:tc>
+          <w:tcPr>
+            <w:tcW w:type="dxa" w:w="4779"/>
+          </w:tcPr>
+          <w:p>
+            <w:r>
+              <w:rPr>
+                <w:rFonts w:ascii="Arial" w:eastAsia="Arial" w:hAnsi="Arial" w:cs="Arial"/>
+                <w:sz w:val="16"/>
+              </w:rPr>
+              <w:t>Envio de e-mails transacionais (confirmação de cadastro, recuperação de senha, ingresso PDF com QR Code e notificações)</w:t>
+            </w:r>
+          </w:p>
+        </w:tc>
+      </w:tr>
+      <w:tr>
+        <w:tc>
+          <w:tcPr>
+            <w:tcW w:type="dxa" w:w="3260"/>
+          </w:tcPr>
+          <w:p>
+            <w:r>
+              <w:rPr>
+                <w:rFonts w:ascii="Arial" w:eastAsia="Arial" w:hAnsi="Arial" w:cs="Arial"/>
+                <w:sz w:val="16"/>
+              </w:rPr>
+              <w:t>Leaflet / react-leaflet</w:t>
+            </w:r>
+          </w:p>
+        </w:tc>
+        <w:tc>
+          <w:tcPr>
+            <w:tcW w:type="dxa" w:w="1418"/>
+          </w:tcPr>
+          <w:p>
+            <w:r>
+              <w:rPr>
+                <w:rFonts w:ascii="Arial" w:eastAsia="Arial" w:hAnsi="Arial" w:cs="Arial"/>
+                <w:sz w:val="16"/>
+              </w:rPr>
+              <w:t>1.9 / 5.0</w:t>
+            </w:r>
+          </w:p>
+        </w:tc>
+        <w:tc>
+          <w:tcPr>
+            <w:tcW w:type="dxa" w:w="4779"/>
+          </w:tcPr>
+          <w:p>
+            <w:r>
+              <w:rPr>
+                <w:rFonts w:ascii="Arial" w:eastAsia="Arial" w:hAnsi="Arial" w:cs="Arial"/>
+                <w:sz w:val="16"/>
+              </w:rPr>
+              <w:t>Mapa interativo da localização do evento na interface</w:t>
+            </w:r>
+          </w:p>
+        </w:tc>
+      </w:tr>
+      <w:tr>
+        <w:tc>
+          <w:tcPr>
+            <w:tcW w:type="dxa" w:w="3260"/>
+          </w:tcPr>
+          <w:p>
+            <w:r>
+              <w:rPr>
+                <w:rFonts w:ascii="Arial" w:eastAsia="Arial" w:hAnsi="Arial" w:cs="Arial"/>
+                <w:sz w:val="16"/>
+              </w:rPr>
+              <w:t>OpenStreetMap</w:t>
+            </w:r>
+          </w:p>
+        </w:tc>
+        <w:tc>
+          <w:tcPr>
+            <w:tcW w:type="dxa" w:w="1418"/>
+          </w:tcPr>
+          <w:p>
+            <w:r>
+              <w:rPr>
+                <w:rFonts w:ascii="Arial" w:eastAsia="Arial" w:hAnsi="Arial" w:cs="Arial"/>
+                <w:sz w:val="16"/>
+              </w:rPr>
+              <w:t>--</w:t>
+            </w:r>
+          </w:p>
+        </w:tc>
+        <w:tc>
+          <w:tcPr>
+            <w:tcW w:type="dxa" w:w="4779"/>
+          </w:tcPr>
+          <w:p>
+            <w:r>
+              <w:rPr>
+                <w:rFonts w:ascii="Arial" w:eastAsia="Arial" w:hAnsi="Arial" w:cs="Arial"/>
+                <w:sz w:val="16"/>
+              </w:rPr>
+              <w:t>Provedor das tiles (camada base) do mapa</w:t>
+            </w:r>
+          </w:p>
+        </w:tc>
+      </w:tr>
+      <w:tr>
+        <w:tc>
+          <w:tcPr>
+            <w:tcW w:type="dxa" w:w="3260"/>
+          </w:tcPr>
+          <w:p>
+            <w:r>
+              <w:rPr>
+                <w:rFonts w:ascii="Arial" w:eastAsia="Arial" w:hAnsi="Arial" w:cs="Arial"/>
+                <w:sz w:val="16"/>
+              </w:rPr>
+              <w:t>Nominatim (OSM)</w:t>
+            </w:r>
+          </w:p>
+        </w:tc>
+        <w:tc>
+          <w:tcPr>
+            <w:tcW w:type="dxa" w:w="1418"/>
+          </w:tcPr>
+          <w:p>
+            <w:r>
+              <w:rPr>
+                <w:rFonts w:ascii="Arial" w:eastAsia="Arial" w:hAnsi="Arial" w:cs="Arial"/>
+                <w:sz w:val="16"/>
+              </w:rPr>
+              <w:t>--</w:t>
+            </w:r>
+          </w:p>
+        </w:tc>
+        <w:tc>
+          <w:tcPr>
+            <w:tcW w:type="dxa" w:w="4779"/>
+          </w:tcPr>
+          <w:p>
+            <w:r>
+              <w:rPr>
+                <w:rFonts w:ascii="Arial" w:eastAsia="Arial" w:hAnsi="Arial" w:cs="Arial"/>
+                <w:sz w:val="16"/>
+              </w:rPr>
+              <w:t>Geocoding / autocomplete de endereço e obtenção de latitude/longitude (sem API key)</w:t>
             </w:r>
           </w:p>
         </w:tc>

</xml_diff>